<commit_message>
Plan empresa por volumen: 3-7 $4.782.800 / 8-15 $4.350.000 / 16-30 $3.950.000 (grupo cerrado), 31+ gerencia, piso $3.5M; la ejecutiva cierra los tres tramos; reglamento 3.6, orden y propuesta hunter
</commit_message>
<xml_diff>
--- a/recursos/comercial/B2B/ORDEN_PLAN_EMPRESA_v1.docx
+++ b/recursos/comercial/B2B/ORDEN_PLAN_EMPRESA_v1.docx
@@ -26,7 +26,7 @@
           <w:color w:val="777777"/>
           <w:sz w:val="17"/>
         </w:rPr>
-        <w:t>Formato estándar (3 a 7 cupos) · Heiiu English Academy — Global Teacher S.A.S., NIT 900.422.478-2 · v1 · octubre de 2026</w:t>
+        <w:t>Formato estándar (3 a 30 cupos) · Heiiu English Academy — Global Teacher S.A.S., NIT 900.422.478-2 · v1 · octubre de 2026</w:t>
       </w:r>
     </w:p>
     <w:p>
@@ -65,7 +65,7 @@
                 <w:b/>
                 <w:sz w:val="18"/>
               </w:rPr>
-              <w:t>Programa</w:t>
+              <w:t>Programa completo A1 → B2 (575 h)</w:t>
             </w:r>
           </w:p>
         </w:tc>
@@ -80,7 +80,7 @@
                 <w:b/>
                 <w:sz w:val="18"/>
               </w:rPr>
-              <w:t>Cupos (3 a 7)</w:t>
+              <w:t>Cupos</w:t>
             </w:r>
           </w:p>
         </w:tc>
@@ -95,7 +95,7 @@
                 <w:b/>
                 <w:sz w:val="18"/>
               </w:rPr>
-              <w:t>Valor por cupo (tarifa corporativa)</w:t>
+              <w:t>Valor por cupo (según el tramo)</w:t>
             </w:r>
           </w:p>
         </w:tc>
@@ -126,7 +126,7 @@
                 <w:b w:val="0"/>
                 <w:sz w:val="18"/>
               </w:rPr>
-              <w:t>Programa completo A1 → B2 (575 h)</w:t>
+              <w:t>Tramo 1: de 3 a 7 cupos (grupos regulares)</w:t>
             </w:r>
           </w:p>
         </w:tc>
@@ -184,7 +184,7 @@
                 <w:b w:val="0"/>
                 <w:sz w:val="18"/>
               </w:rPr>
-              <w:t>Programa A2 → B2</w:t>
+              <w:t>Tramo 2: de 8 a 15 cupos (grupos regulares, o grupo cerrado en la sede desde 12)</w:t>
             </w:r>
           </w:p>
         </w:tc>
@@ -212,7 +212,7 @@
                 <w:b w:val="0"/>
                 <w:sz w:val="18"/>
               </w:rPr>
-              <w:t>$ ______________ (según tabla vigente)</w:t>
+              <w:t>$4.350.000</w:t>
             </w:r>
           </w:p>
         </w:tc>
@@ -242,7 +242,7 @@
                 <w:b w:val="0"/>
                 <w:sz w:val="18"/>
               </w:rPr>
-              <w:t>Programa B1 → B2</w:t>
+              <w:t>Tramo 3: de 16 a 30 cupos (grupo cerrado en la sede o en la empresa)</w:t>
             </w:r>
           </w:p>
         </w:tc>
@@ -270,7 +270,7 @@
                 <w:b w:val="0"/>
                 <w:sz w:val="18"/>
               </w:rPr>
-              <w:t>$ ______________ (según tabla vigente)</w:t>
+              <w:t>$3.950.000</w:t>
             </w:r>
           </w:p>
         </w:tc>
@@ -300,7 +300,7 @@
                 <w:b/>
                 <w:sz w:val="18"/>
               </w:rPr>
-              <w:t>TOTAL</w:t>
+              <w:t>TOTAL (un solo tramo por orden)</w:t>
             </w:r>
           </w:p>
         </w:tc>
@@ -367,7 +367,7 @@
         <w:rPr>
           <w:sz w:val="19"/>
         </w:rPr>
-        <w:t>Los cupos contratados en los grupos regulares de la academia (jornadas y niveles vigentes), con el mismo programa, materiales, certificado por nivel y garantía de aprendizaje por escrito que cualquier estudiante. Cada colaborador firma su contrato de matrícula y su anexo de garantía; LA EMPRESA es quien paga.</w:t>
+        <w:t>Los cupos contratados, con el mismo programa, materiales, certificado por nivel y garantía de aprendizaje por escrito que cualquier estudiante. Tramo 1 y 2: en los grupos regulares de la academia (jornadas vigentes); desde 12 cupos puede abrirse grupo cerrado en la sede. Tramo 3: grupo cerrado en la sede o en las instalaciones de LA EMPRESA, de lunes a viernes entre 7:00 am y 8:00 pm, con horario fijo acordado por escrito. Cada colaborador firma su contrato de matrícula y su anexo de garantía; LA EMPRESA es quien paga.</w:t>
       </w:r>
     </w:p>
     <w:p>
@@ -385,7 +385,7 @@
         <w:rPr>
           <w:sz w:val="19"/>
         </w:rPr>
-        <w:t>☐ De contado contra factura, antes del inicio de clases.   ☐ 30% inicial contra factura y el saldo en tres (3) cuotas mensuales iguales, la última antes de terminar el primer nivel.   ☐ Copago: LA EMPRESA paga $ ______________ por cupo y el colaborador paga el saldo con su propio contrato de matrícula.</w:t>
+        <w:t>☐ De contado contra factura, antes del inicio de clases.   ☐ Inicial contra factura (30% en el tramo 1; 40% en los tramos 2 y 3) y el saldo en tres (3) cuotas mensuales iguales, la última antes de terminar el primer nivel.   ☐ Copago: LA EMPRESA paga $ ______________ por cupo y el colaborador paga el saldo con su propio contrato de matrícula.</w:t>
       </w:r>
     </w:p>
     <w:p>
@@ -439,7 +439,7 @@
         <w:rPr>
           <w:sz w:val="19"/>
         </w:rPr>
-        <w:t>Clases en las instalaciones de LA EMPRESA, horarios exclusivos, grupos cerrados, ocho (8) cupos o más, plazos distintos de los del numeral 2 y cualquier descuento adicional. Esas condiciones se acuerdan por separado con la gerencia de la academia.</w:t>
+        <w:t>Más de treinta (30) cupos, horarios fuera de la franja indicada, plazos distintos de los del numeral 2 y cualquier valor distinto de los tres tramos. Esas condiciones las cotiza por separado la gerencia de la academia.</w:t>
       </w:r>
     </w:p>
     <w:p>
@@ -542,7 +542,7 @@
           <w:color w:val="777777"/>
           <w:sz w:val="17"/>
         </w:rPr>
-        <w:t>Presentado por: ______________________________ (docente habilitado Heiiu) · Fecha: ____ / ____ / 2026</w:t>
+        <w:t>Presentado por: ______________________________ (ejecutiva de alianzas Heiiu) · Fecha: ____ / ____ / 2026</w:t>
       </w:r>
     </w:p>
     <w:sectPr>

</xml_diff>